<commit_message>
feat: port single-connection, auto-connect fix, delete bypass, Chinese labels
- Add source port single-connection check (both input & output ports now restricted)
- Fix auto-connect: two-phase pre-population + iterative scanning, try all candidates until canConnect succeeds
- Add delete auto-bypass: automatically connect upstream to downstream when deleting a middle node (skip multi-port)
- Improve drag connection: 20px snap radius, larger port click area (12px->14px)
- Localize all 60+ parameter labels to Chinese in property panel
- Update Word report and README
</commit_message>
<xml_diff>
--- a/大作业报告_ImageNodeEditor.docx
+++ b/大作业报告_ImageNodeEditor.docx
@@ -1857,7 +1857,7 @@
         <w:rPr>
           <w:rFonts w:hint="eastAsia" w:ascii="宋体" w:hAnsi="宋体" w:eastAsia="宋体" w:cs="宋体"/>
         </w:rPr>
-        <w:t>替换节点：右键菜单触发，创建新节点后尝试重连所有原始连线，若端口不兼容则自动回滚，保证工作流完整性；F6 一键自动连线，按节点水平位置从左到右排序连接。</w:t>
+        <w:t>替换节点：右键菜单触发，创建新节点后尝试重连所有原始连线，若端口不兼容则自动回滚，保证工作流完整性；F6 一键自动连线：两阶段算法——先预填充已就绪节点的输出到可用池，再迭代扫描未连节点，逐个尝试候选输出直至 canConnect 成功。</w:t>
       </w:r>
     </w:p>
     <w:p>
@@ -2051,7 +2051,7 @@
         <w:rPr>
           <w:rFonts w:hint="eastAsia" w:ascii="宋体" w:hAnsi="宋体" w:eastAsia="宋体" w:cs="宋体"/>
         </w:rPr>
-        <w:t>PropertyPanel：自动根据节点参数类型生成编辑控件（QSpinBox、QDoubleSpinBox、QCheckBox、QLineEdit），文件路径附带浏览对话框。</w:t>
+        <w:t>PropertyPanel：自动根据节点参数类型生成编辑控件（QSpinBox、QDoubleSpinBox、QCheckBox、QLineEdit），所有标签已中文化（60+ 参数），文件路径附带浏览对话框。</w:t>
       </w:r>
     </w:p>
     <w:p>
@@ -2261,6 +2261,76 @@
           <w:rFonts w:hint="eastAsia" w:ascii="宋体" w:hAnsi="宋体" w:eastAsia="宋体" w:cs="宋体"/>
         </w:rPr>
         <w:t>缺乏性能优化：大图像处理时缺少进度反馈和异步执行机制（QThread/QFuture），界面可能短暂无响应。</w:t>
+      </w:r>
+    </w:p>
+    <w:p>
+      <w:pPr>
+        <w:pStyle w:val="16"/>
+        <w:rPr>
+          <w:rFonts w:hint="eastAsia" w:ascii="宋体" w:hAnsi="宋体" w:eastAsia="宋体" w:cs="宋体"/>
+        </w:rPr>
+      </w:pPr>
+      <w:r>
+        <w:rPr>
+          <w:rFonts w:hint="eastAsia" w:ascii="宋体" w:hAnsi="宋体" w:eastAsia="宋体" w:cs="宋体"/>
+        </w:rPr>
+        <w:t>端口单连线限制：输出端口新增单连线检查，防止端口被多次占用。</w:t>
+      </w:r>
+    </w:p>
+    <w:p>
+      <w:pPr>
+        <w:pStyle w:val="16"/>
+        <w:rPr>
+          <w:rFonts w:hint="eastAsia" w:ascii="宋体" w:hAnsi="宋体" w:eastAsia="宋体" w:cs="宋体"/>
+        </w:rPr>
+      </w:pPr>
+      <w:r>
+        <w:rPr>
+          <w:rFonts w:hint="eastAsia" w:ascii="宋体" w:hAnsi="宋体" w:eastAsia="宋体" w:cs="宋体"/>
+        </w:rPr>
+        <w:t>自动连线算法修复：遍历池中所有类型兼容的候选输出，逐个尝试 canConnect 直至成功，解决了终端节点在有现存连线时连不上的问题。</w:t>
+      </w:r>
+    </w:p>
+    <w:p>
+      <w:pPr>
+        <w:pStyle w:val="16"/>
+        <w:rPr>
+          <w:rFonts w:hint="eastAsia" w:ascii="宋体" w:hAnsi="宋体" w:eastAsia="宋体" w:cs="宋体"/>
+        </w:rPr>
+      </w:pPr>
+      <w:r>
+        <w:rPr>
+          <w:rFonts w:hint="eastAsia" w:ascii="宋体" w:hAnsi="宋体" w:eastAsia="宋体" w:cs="宋体"/>
+        </w:rPr>
+        <w:t>删除节点自动旁路：删除中间节点时自动记录原连线，删除后尝试将上游直连到下游（跳过多端口节点）。</w:t>
+      </w:r>
+    </w:p>
+    <w:p>
+      <w:pPr>
+        <w:pStyle w:val="16"/>
+        <w:rPr>
+          <w:rFonts w:hint="eastAsia" w:ascii="宋体" w:hAnsi="宋体" w:eastAsia="宋体" w:cs="宋体"/>
+        </w:rPr>
+      </w:pPr>
+      <w:r>
+        <w:rPr>
+          <w:rFonts w:hint="eastAsia" w:ascii="宋体" w:hAnsi="宋体" w:eastAsia="宋体" w:cs="宋体"/>
+        </w:rPr>
+        <w:t>拖拽连线体验优化：增大端口点击区域，释放时 20px 半径自动吸附最近端口。</w:t>
+      </w:r>
+    </w:p>
+    <w:p>
+      <w:pPr>
+        <w:pStyle w:val="16"/>
+        <w:rPr>
+          <w:rFonts w:hint="eastAsia" w:ascii="宋体" w:hAnsi="宋体" w:eastAsia="宋体" w:cs="宋体"/>
+        </w:rPr>
+      </w:pPr>
+      <w:r>
+        <w:rPr>
+          <w:rFonts w:hint="eastAsia" w:ascii="宋体" w:hAnsi="宋体" w:eastAsia="宋体" w:cs="宋体"/>
+        </w:rPr>
+        <w:t>参数面板中文化：全面补全 60+ 参数的中文标签映射。</w:t>
       </w:r>
     </w:p>
     <w:p>

</xml_diff>

<commit_message>
fix: clean up extra spaces in Word document
</commit_message>
<xml_diff>
--- a/大作业报告_ImageNodeEditor.docx
+++ b/大作业报告_ImageNodeEditor.docx
@@ -67,7 +67,7 @@
         <w:rPr>
           <w:rFonts w:hint="eastAsia" w:ascii="宋体" w:hAnsi="宋体" w:eastAsia="宋体" w:cs="宋体"/>
         </w:rPr>
-        <w:t>1.1 项目背景</w:t>
+        <w:t>1.1项目背景</w:t>
       </w:r>
     </w:p>
     <w:p>
@@ -80,15 +80,7 @@
         <w:rPr>
           <w:rFonts w:hint="eastAsia" w:ascii="宋体" w:hAnsi="宋体" w:eastAsia="宋体" w:cs="宋体"/>
         </w:rPr>
-        <w:t>本课程大作业实现了一个基于节点编辑器的图像处理工作流工具（ImageNodeEditor），用户通过拖拽连接节点的方式构建图像处理管线，无需编写代码即可完成复杂的图</w:t>
-      </w:r>
-      <w:bookmarkStart w:id="0" w:name="_GoBack"/>
-      <w:bookmarkEnd w:id="0"/>
-      <w:r>
-        <w:rPr>
-          <w:rFonts w:hint="eastAsia" w:ascii="宋体" w:hAnsi="宋体" w:eastAsia="宋体" w:cs="宋体"/>
-        </w:rPr>
-        <w:t>像处理任务。项目使用 C++17 和 Qt5 框架开发，采用 CMake 构建系统，支持 Windows 平台。</w:t>
+        <w:t>本课程大作业实现了一个基于节点编辑器的图像处理工作流工具（ImageNodeEditor），用户通过拖拽连接节点的方式构建图像处理管线，无需编写代码即可完成复杂的图像处理任务。项目使用C++17和Qt5框架开发，采用CMake构建系统，支持Windows平台。</w:t>
       </w:r>
     </w:p>
     <w:p>
@@ -102,7 +94,7 @@
         <w:rPr>
           <w:rFonts w:hint="eastAsia" w:ascii="宋体" w:hAnsi="宋体" w:eastAsia="宋体" w:cs="宋体"/>
         </w:rPr>
-        <w:t>1.2 功能简介</w:t>
+        <w:t>1.2功能简介</w:t>
       </w:r>
     </w:p>
     <w:p>
@@ -115,7 +107,7 @@
         <w:rPr>
           <w:rFonts w:hint="eastAsia" w:ascii="宋体" w:hAnsi="宋体" w:eastAsia="宋体" w:cs="宋体"/>
         </w:rPr>
-        <w:t>ImageNodeEditor 提供了 40 种不同类型的图像处理节点，分为输入、输出、滤波、风格化、色彩调整、几何变换、转换、多端口等九大类别。用户可以通过可视化界面拖拽添加节点、连线建立数据通路、调节参数实时预览效果，并支持工作流的保存与加载。</w:t>
+        <w:t>ImageNodeEditor提供了40种不同类型的图像处理节点，分为输入、输出、滤波、风格化、色彩调整、几何变换、转换、多端口等九大类别。用户可以通过可视化界面拖拽添加节点、连线建立数据通路、调节参数实时预览效果，并支持工作流的保存与加载。</w:t>
       </w:r>
     </w:p>
     <w:p>
@@ -129,7 +121,7 @@
         <w:rPr>
           <w:rFonts w:hint="eastAsia" w:ascii="宋体" w:hAnsi="宋体" w:eastAsia="宋体" w:cs="宋体"/>
         </w:rPr>
-        <w:t>1.3 技术栈</w:t>
+        <w:t>1.3技术栈</w:t>
       </w:r>
     </w:p>
     <w:p>
@@ -165,13 +157,12 @@
           <w:rFonts w:hint="eastAsia" w:ascii="宋体" w:hAnsi="宋体" w:eastAsia="宋体" w:cs="宋体"/>
           <w:b/>
         </w:rPr>
-        <w:t>GUI 框架：</w:t>
+        <w:t>GUI框架：Qt 5.15+（Core, Gui, Widgets）</w:t>
       </w:r>
       <w:r>
         <w:rPr>
           <w:rFonts w:hint="eastAsia" w:ascii="宋体" w:hAnsi="宋体" w:eastAsia="宋体" w:cs="宋体"/>
         </w:rPr>
-        <w:t>Qt 5.15+（Core, Gui, Widgets）</w:t>
       </w:r>
     </w:p>
     <w:p>
@@ -228,13 +219,12 @@
           <w:rFonts w:hint="eastAsia" w:ascii="宋体" w:hAnsi="宋体" w:eastAsia="宋体" w:cs="宋体"/>
           <w:b/>
         </w:rPr>
-        <w:t>数据结构：</w:t>
+        <w:t>数据结构：有向无环图（DAG）、拓扑排序（Kahn算法）、LUT预计算</w:t>
       </w:r>
       <w:r>
         <w:rPr>
           <w:rFonts w:hint="eastAsia" w:ascii="宋体" w:hAnsi="宋体" w:eastAsia="宋体" w:cs="宋体"/>
         </w:rPr>
-        <w:t>有向无环图（DAG）、拓扑排序（Kahn 算法）、LUT 预计算</w:t>
       </w:r>
     </w:p>
     <w:p>
@@ -262,7 +252,7 @@
         <w:rPr>
           <w:rFonts w:hint="eastAsia" w:ascii="宋体" w:hAnsi="宋体" w:eastAsia="宋体" w:cs="宋体"/>
         </w:rPr>
-        <w:t>2.1 整体架构</w:t>
+        <w:t>2.1整体架构</w:t>
       </w:r>
     </w:p>
     <w:p>
@@ -427,7 +417,7 @@
                 <w:color w:val="376092" w:themeColor="accent1" w:themeShade="BF"/>
                 <w:sz w:val="21"/>
               </w:rPr>
-              <w:t>Core 核心框架</w:t>
+              <w:t>Core核心框架</w:t>
             </w:r>
           </w:p>
         </w:tc>
@@ -473,7 +463,7 @@
                 <w:color w:val="376092" w:themeColor="accent1" w:themeShade="BF"/>
                 <w:sz w:val="21"/>
               </w:rPr>
-              <w:t>Node 基类、端口定义、数据类型、节点注册工厂</w:t>
+              <w:t>Node基类、端口定义、数据类型、节点注册工厂</w:t>
             </w:r>
           </w:p>
         </w:tc>
@@ -514,7 +504,7 @@
                 <w:color w:val="376092" w:themeColor="accent1" w:themeShade="BF"/>
                 <w:sz w:val="21"/>
               </w:rPr>
-              <w:t>Algorithms 算法层</w:t>
+              <w:t>Algorithms算法层</w:t>
             </w:r>
           </w:p>
         </w:tc>
@@ -601,7 +591,7 @@
                 <w:color w:val="376092" w:themeColor="accent1" w:themeShade="BF"/>
                 <w:sz w:val="21"/>
               </w:rPr>
-              <w:t>Nodes 节点实现</w:t>
+              <w:t>Nodes节点实现</w:t>
             </w:r>
           </w:p>
         </w:tc>
@@ -647,7 +637,7 @@
                 <w:color w:val="376092" w:themeColor="accent1" w:themeShade="BF"/>
                 <w:sz w:val="21"/>
               </w:rPr>
-              <w:t>40 个具体节点，继承 Node 基类实现 process()</w:t>
+              <w:t>40个具体节点，继承Node基类实现process()</w:t>
             </w:r>
           </w:p>
         </w:tc>
@@ -688,7 +678,7 @@
                 <w:color w:val="376092" w:themeColor="accent1" w:themeShade="BF"/>
                 <w:sz w:val="21"/>
               </w:rPr>
-              <w:t>Engine 工作流引擎</w:t>
+              <w:t>Engine工作流引擎</w:t>
             </w:r>
           </w:p>
         </w:tc>
@@ -734,7 +724,7 @@
                 <w:color w:val="376092" w:themeColor="accent1" w:themeShade="BF"/>
                 <w:sz w:val="21"/>
               </w:rPr>
-              <w:t>WorkflowEngine 管理 DAG 节点拓扑与执行</w:t>
+              <w:t>WorkflowEngine管理DAG节点拓扑与执行</w:t>
             </w:r>
           </w:p>
         </w:tc>
@@ -775,7 +765,7 @@
                 <w:color w:val="376092" w:themeColor="accent1" w:themeShade="BF"/>
                 <w:sz w:val="21"/>
               </w:rPr>
-              <w:t>GUI 图形界面</w:t>
+              <w:t>GUI图形界面</w:t>
             </w:r>
           </w:p>
         </w:tc>
@@ -862,7 +852,7 @@
                 <w:color w:val="376092" w:themeColor="accent1" w:themeShade="BF"/>
                 <w:sz w:val="21"/>
               </w:rPr>
-              <w:t>IO 序列化</w:t>
+              <w:t>IO序列化</w:t>
             </w:r>
           </w:p>
         </w:tc>
@@ -908,7 +898,7 @@
                 <w:color w:val="376092" w:themeColor="accent1" w:themeShade="BF"/>
                 <w:sz w:val="21"/>
               </w:rPr>
-              <w:t>WorkflowSerializer JSON 序列化/反序列化</w:t>
+              <w:t>WorkflowSerializer JSON序列化/反序列化</w:t>
             </w:r>
           </w:p>
         </w:tc>
@@ -949,7 +939,7 @@
                 <w:color w:val="376092" w:themeColor="accent1" w:themeShade="BF"/>
                 <w:sz w:val="21"/>
               </w:rPr>
-              <w:t>CLI 命令行接口</w:t>
+              <w:t>CLI命令行接口</w:t>
             </w:r>
           </w:p>
         </w:tc>
@@ -995,7 +985,7 @@
                 <w:color w:val="376092" w:themeColor="accent1" w:themeShade="BF"/>
                 <w:sz w:val="21"/>
               </w:rPr>
-              <w:t>CommandLineRunner 无 GUI 执行工作流</w:t>
+              <w:t>CommandLineRunner无GUI执行工作流</w:t>
             </w:r>
           </w:p>
         </w:tc>
@@ -1019,7 +1009,7 @@
         <w:rPr>
           <w:rFonts w:hint="eastAsia" w:ascii="宋体" w:hAnsi="宋体" w:eastAsia="宋体" w:cs="宋体"/>
         </w:rPr>
-        <w:t>2.2 核心类设计</w:t>
+        <w:t>2.2核心类设计</w:t>
       </w:r>
     </w:p>
     <w:p>
@@ -1034,13 +1024,12 @@
           <w:rFonts w:hint="eastAsia" w:ascii="宋体" w:hAnsi="宋体" w:eastAsia="宋体" w:cs="宋体"/>
           <w:b/>
         </w:rPr>
-        <w:t>Node 基类：</w:t>
+        <w:t>Node基类：所有处理节点的抽象基类，继承自QObject。定义了端口（QVector&lt;Port&gt;）、参数系统（QMap&lt;QString, QVariant&gt; + ParamBound边界约束）、纯虚函数process() 和clone()。参数变更时发射paramsChanged() 信号。</w:t>
       </w:r>
       <w:r>
         <w:rPr>
           <w:rFonts w:hint="eastAsia" w:ascii="宋体" w:hAnsi="宋体" w:eastAsia="宋体" w:cs="宋体"/>
         </w:rPr>
-        <w:t>所有处理节点的抽象基类，继承自 QObject。定义了端口（QVector&lt;Port&gt;）、参数系统（QMap&lt;QString, QVariant&gt; + ParamBound 边界约束）、纯虚函数 process() 和 clone()。参数变更时发射 paramsChanged() 信号。</w:t>
       </w:r>
     </w:p>
     <w:p>
@@ -1055,7 +1044,7 @@
           <w:rFonts w:hint="eastAsia" w:ascii="宋体" w:hAnsi="宋体" w:eastAsia="宋体" w:cs="宋体"/>
           <w:b/>
         </w:rPr>
-        <w:t>NodeRegistry 单例工厂：全局唯一的节点注册表，管理 40 种节点类型的创建函数。提供 categorizedEntries() 按预设分类顺序输出，支持左侧面板分类展示。</w:t>
+        <w:t>NodeRegistry单例工厂：全局唯一的节点注册表，管理40种节点类型的创建函数。提供categorizedEntries() 按预设分类顺序输出，支持左侧面板分类展示。</w:t>
       </w:r>
     </w:p>
     <w:p>
@@ -1070,13 +1059,12 @@
           <w:rFonts w:hint="eastAsia" w:ascii="宋体" w:hAnsi="宋体" w:eastAsia="宋体" w:cs="宋体"/>
           <w:b/>
         </w:rPr>
-        <w:t>WorkflowEngine 引擎：</w:t>
+        <w:t>WorkflowEngine引擎：管理节点（QMap&lt;QUuid, Node*&gt;）和连线（QVector&lt;Connection&gt;）。核心功能包括：端口类型兼容性检查、DAG环检测（Kahn拓扑排序）、可达性分析（双向BFS找出完整通路）、按拓扑顺序依次执行。</w:t>
       </w:r>
       <w:r>
         <w:rPr>
           <w:rFonts w:hint="eastAsia" w:ascii="宋体" w:hAnsi="宋体" w:eastAsia="宋体" w:cs="宋体"/>
         </w:rPr>
-        <w:t>管理节点（QMap&lt;QUuid, Node*&gt;）和连线（QVector&lt;Connection&gt;）。核心功能包括：端口类型兼容性检查、DAG 环检测（Kahn 拓扑排序）、可达性分析（双向 BFS 找出完整通路）、按拓扑顺序依次执行。</w:t>
       </w:r>
     </w:p>
     <w:p>
@@ -1091,13 +1079,12 @@
           <w:rFonts w:hint="eastAsia" w:ascii="宋体" w:hAnsi="宋体" w:eastAsia="宋体" w:cs="宋体"/>
           <w:b/>
         </w:rPr>
-        <w:t>DataPacket 数据包：</w:t>
+        <w:t>DataPacket数据包：节点间传递的数据载体，支持单张QImage或QVector&lt;QImage&gt; 列表。提供isValid()、image()、imageList()、firstImage() 等便捷接口。</w:t>
       </w:r>
       <w:r>
         <w:rPr>
           <w:rFonts w:hint="eastAsia" w:ascii="宋体" w:hAnsi="宋体" w:eastAsia="宋体" w:cs="宋体"/>
         </w:rPr>
-        <w:t>节点间传递的数据载体，支持单张 QImage 或 QVector&lt;QImage&gt; 列表。提供 isValid()、image()、imageList()、firstImage() 等便捷接口。</w:t>
       </w:r>
     </w:p>
     <w:p>
@@ -1111,7 +1098,7 @@
         <w:rPr>
           <w:rFonts w:hint="eastAsia" w:ascii="宋体" w:hAnsi="宋体" w:eastAsia="宋体" w:cs="宋体"/>
         </w:rPr>
-        <w:t>2.3 数据流架构</w:t>
+        <w:t>2.3数据流架构</w:t>
       </w:r>
     </w:p>
     <w:p>
@@ -1124,7 +1111,7 @@
         <w:rPr>
           <w:rFonts w:hint="eastAsia" w:ascii="宋体" w:hAnsi="宋体" w:eastAsia="宋体" w:cs="宋体"/>
         </w:rPr>
-        <w:t>用户通过 GUI 拖拽建立节点连线，形成有向无环图（DAG）。执行时，WorkflowEngine 首先进行双向 BFS 可达性分析，从起点（入度为 0 且有输出的节点）正向可达集和终点（出度为 0 且有输入的节点）反向可达集的交集确定"活跃节点集"，再进行拓扑排序，按序执行每个节点的 process() 方法，将输出 DataPacket 存入结果映射表供下游使用。</w:t>
+        <w:t>用户通过GUI拖拽建立节点连线，形成有向无环图（DAG）。执行时，WorkflowEngine首先进行双向BFS可达性分析，从起点（入度为0且有输出的节点）正向可达集和终点（出度为0且有输入的节点）反向可达集的交集确定"活跃节点集"，再进行拓扑排序，按序执行每个节点的process() 方法，将输出DataPacket存入结果映射表供下游使用。</w:t>
       </w:r>
     </w:p>
     <w:p>
@@ -1152,7 +1139,7 @@
         <w:rPr>
           <w:rFonts w:hint="eastAsia" w:ascii="宋体" w:hAnsi="宋体" w:eastAsia="宋体" w:cs="宋体"/>
         </w:rPr>
-        <w:t>3.1 节点系统</w:t>
+        <w:t>3.1节点系统</w:t>
       </w:r>
     </w:p>
     <w:p>
@@ -1165,7 +1152,7 @@
         <w:rPr>
           <w:rFonts w:hint="eastAsia" w:ascii="宋体" w:hAnsi="宋体" w:eastAsia="宋体" w:cs="宋体"/>
         </w:rPr>
-        <w:t>40 个处理节点按功能分为 8 类。每个节点继承 Node 基类，在构造函数中声明端口和默认参数，实现 process() 方法调用 ImageAlgorithm 中的对应算法函数。节点支持参数边界约束（setParamBound），属性面板自动为数值参数生成带范围限制的 QSpinBox/QDoubleSpinBox。</w:t>
+        <w:t>40个处理节点按功能分为8类。每个节点继承Node基类，在构造函数中声明端口和默认参数，实现process() 方法调用ImageAlgorithm中的对应算法函数。节点支持参数边界约束（setParamBound），属性面板自动为数值参数生成带范围限制的QSpinBox/QDoubleSpinBox。</w:t>
       </w:r>
     </w:p>
     <w:tbl>
@@ -1788,7 +1775,7 @@
         <w:rPr>
           <w:rFonts w:hint="eastAsia" w:ascii="宋体" w:hAnsi="宋体" w:eastAsia="宋体" w:cs="宋体"/>
         </w:rPr>
-        <w:t>3.2 工作流引擎</w:t>
+        <w:t>3.2工作流引擎</w:t>
       </w:r>
     </w:p>
     <w:p>
@@ -1801,7 +1788,7 @@
         <w:rPr>
           <w:rFonts w:hint="eastAsia" w:ascii="宋体" w:hAnsi="宋体" w:eastAsia="宋体" w:cs="宋体"/>
         </w:rPr>
-        <w:t>WorkflowEngine 是整个应用的核心控制模块，负责管理节点生命周期、连线拓扑和执行调度：</w:t>
+        <w:t>WorkflowEngine是整个应用的核心控制模块，负责管理节点生命周期、连线拓扑和执行调度：</w:t>
       </w:r>
     </w:p>
     <w:p>
@@ -1815,7 +1802,7 @@
         <w:rPr>
           <w:rFonts w:hint="eastAsia" w:ascii="宋体" w:hAnsi="宋体" w:eastAsia="宋体" w:cs="宋体"/>
         </w:rPr>
-        <w:t>拓扑排序与环检测：使用 Kahn 算法计算节点的线性执行顺序，若结果节点数少于总节点数则判定存在环。</w:t>
+        <w:t>拓扑排序与环检测：使用Kahn算法计算节点的线性执行顺序，若结果节点数少于总节点数则判定存在环。</w:t>
       </w:r>
     </w:p>
     <w:p>
@@ -1843,7 +1830,7 @@
         <w:rPr>
           <w:rFonts w:hint="eastAsia" w:ascii="宋体" w:hAnsi="宋体" w:eastAsia="宋体" w:cs="宋体"/>
         </w:rPr>
-        <w:t>可达性分析：执行前通过正向 BFS（从起点）和反向 BFS（从终点）取交集，确定活跃节点集，跳过孤立节点。</w:t>
+        <w:t>可达性分析：执行前通过正向BFS（从起点）和反向BFS（从终点）取交集，确定活跃节点集，跳过孤立节点。</w:t>
       </w:r>
     </w:p>
     <w:p>
@@ -1857,7 +1844,7 @@
         <w:rPr>
           <w:rFonts w:hint="eastAsia" w:ascii="宋体" w:hAnsi="宋体" w:eastAsia="宋体" w:cs="宋体"/>
         </w:rPr>
-        <w:t>替换节点：右键菜单触发，创建新节点后尝试重连所有原始连线，若端口不兼容则自动回滚，保证工作流完整性；F6 一键自动连线：两阶段算法——先预填充已就绪节点的输出到可用池，再迭代扫描未连节点，逐个尝试候选输出直至 canConnect 成功。</w:t>
+        <w:t>替换节点：右键菜单触发，创建新节点后尝试重连所有原始连线，若端口不兼容则自动回滚，保证工作流完整性；F6一键自动连线：两阶段算法——先预填充已就绪节点的输出到可用池，再迭代扫描未连节点，逐个尝试候选输出直至canConnect成功。</w:t>
       </w:r>
     </w:p>
     <w:p>
@@ -1871,7 +1858,7 @@
         <w:rPr>
           <w:rFonts w:hint="eastAsia" w:ascii="宋体" w:hAnsi="宋体" w:eastAsia="宋体" w:cs="宋体"/>
         </w:rPr>
-        <w:t>3.3 图像处理算法</w:t>
+        <w:t>3.3图像处理算法</w:t>
       </w:r>
     </w:p>
     <w:p>
@@ -1884,7 +1871,7 @@
         <w:rPr>
           <w:rFonts w:hint="eastAsia" w:ascii="宋体" w:hAnsi="宋体" w:eastAsia="宋体" w:cs="宋体"/>
         </w:rPr>
-        <w:t>ImageAlgorithm 提供 20+ 种无状态纯函数图像处理算法，所有函数均线程安全。主要实现：</w:t>
+        <w:t>ImageAlgorithm提供20+ 种无状态纯函数图像处理算法，所有函数均线程安全。主要实现：</w:t>
       </w:r>
     </w:p>
     <w:p>
@@ -1898,7 +1885,7 @@
         <w:rPr>
           <w:rFonts w:hint="eastAsia" w:ascii="宋体" w:hAnsi="宋体" w:eastAsia="宋体" w:cs="宋体"/>
         </w:rPr>
-        <w:t>色彩调整：HSL 色彩空间转换实现饱和度调节和色相偏移；LUT 预计算加速亮度/对比度、伽马校正、曝光度调整。</w:t>
+        <w:t>色彩调整：HSL色彩空间转换实现饱和度调节和色相偏移；LUT预计算加速亮度/对比度、伽马校正、曝光度调整。</w:t>
       </w:r>
     </w:p>
     <w:p>
@@ -1912,7 +1899,7 @@
         <w:rPr>
           <w:rFonts w:hint="eastAsia" w:ascii="宋体" w:hAnsi="宋体" w:eastAsia="宋体" w:cs="宋体"/>
         </w:rPr>
-        <w:t>滤波算法：可分离高斯模糊（水平+垂直一维卷积）；Sobel 边缘检测（3×3 梯度算子 + 双阈值）；4-邻域拉普拉斯锐化。</w:t>
+        <w:t>滤波算法：可分离高斯模糊（水平+垂直一维卷积）；Sobel边缘检测（3×3梯度算子 + 双阈值）；4-邻域拉普拉斯锐化。</w:t>
       </w:r>
     </w:p>
     <w:p>
@@ -1926,7 +1913,7 @@
         <w:rPr>
           <w:rFonts w:hint="eastAsia" w:ascii="宋体" w:hAnsi="宋体" w:eastAsia="宋体" w:cs="宋体"/>
         </w:rPr>
-        <w:t>风格化效果：像素画（块采样 + 近邻填充 + 正方形/圆角方形/圆形三种轮廓 + 独立调节轮廓粗细与背景色黑白切换）；暗角（径向余弦衰减）；铅笔画（反色 + 高斯模糊 + Sobel 边缘叠加 + 细节增强、原图对比预览）；卡通（颜色量化 + Sobel 边缘描边）；漫画风（黑色轮廓线 + 白色填充，可调边阈值与线宽）；油画效果（局部亮度量化统计模拟笔触，大图自动降分辨率防卡顿）；极坐标（双线性插值直角↔极坐标双向转换，两种映射模式）；镜头光晕（QPainter 合成中心光斑+光环+水平炫光+色散光斑，可调位置/亮度/尺寸）；金属底板（四色渐变映射+凸版/凹版浮雕+铜锈纹理+光泽高光，支持金/银/青铜/古铜色调）。</w:t>
+        <w:t>风格化效果：像素画（块采样 + 近邻填充 + 正方形/圆角方形/圆形三种轮廓 + 独立调节轮廓粗细与背景色黑白切换）；暗角（径向余弦衰减）；铅笔画（反色 + 高斯模糊 + Sobel边缘叠加 + 细节增强、原图对比预览）；卡通（颜色量化 + Sobel边缘描边）；漫画风（黑色轮廓线 + 白色填充，可调边阈值与线宽）；油画效果（局部亮度量化统计模拟笔触，大图自动降分辨率防卡顿）；极坐标（双线性插值直角↔极坐标双向转换，两种映射模式）；镜头光晕（QPainter合成中心光斑+光环+水平炫光+色散光斑，可调位置/亮度/尺寸）；金属底板（四色渐变映射+凸版/凹版浮雕+铜锈纹理+光泽高光，支持金/银/青铜/古铜色调）。</w:t>
       </w:r>
     </w:p>
     <w:p>
@@ -1940,7 +1927,7 @@
         <w:rPr>
           <w:rFonts w:hint="eastAsia" w:ascii="宋体" w:hAnsi="宋体" w:eastAsia="宋体" w:cs="宋体"/>
         </w:rPr>
-        <w:t>色调曲线：白/R/G/B 四通道独立 256 级 LUT，支持 Catmull-Rom 平滑曲线插值，交互式编辑器可拖拽添加/调整节点。</w:t>
+        <w:t>色调曲线：白/R/G/B四通道独立256级LUT，支持Catmull-Rom平滑曲线插值，交互式编辑器可拖拽添加/调整节点。</w:t>
       </w:r>
     </w:p>
     <w:p>
@@ -1954,7 +1941,7 @@
         <w:rPr>
           <w:rFonts w:hint="eastAsia" w:ascii="宋体" w:hAnsi="宋体" w:eastAsia="宋体" w:cs="宋体"/>
         </w:rPr>
-        <w:t>高级色彩：白平衡（色温/色调增益 + 灰度世界自动校正）；自然饱和度（智能增强低饱和区域，保护肤色）；阴影/高光（基于亮度掩膜的独立调节）；渐变映射（交互式渐变编辑器，点击添加/拖拽调整色标、双击选色、右键删除，8 种预设渐变方案，工作流保存完整渐变状态）。</w:t>
+        <w:t>高级色彩：白平衡（色温/色调增益 + 灰度世界自动校正）；自然饱和度（智能增强低饱和区域，保护肤色）；阴影/高光（基于亮度掩膜的独立调节）；渐变映射（交互式渐变编辑器，点击添加/拖拽调整色标、双击选色、右键删除，8种预设渐变方案，工作流保存完整渐变状态）。</w:t>
       </w:r>
     </w:p>
     <w:p>
@@ -1968,7 +1955,7 @@
         <w:rPr>
           <w:rFonts w:hint="eastAsia" w:ascii="宋体" w:hAnsi="宋体" w:eastAsia="宋体" w:cs="宋体"/>
         </w:rPr>
-        <w:t>3.4 图形界面</w:t>
+        <w:t>3.4图形界面</w:t>
       </w:r>
     </w:p>
     <w:p>
@@ -1981,7 +1968,7 @@
         <w:rPr>
           <w:rFonts w:hint="eastAsia" w:ascii="宋体" w:hAnsi="宋体" w:eastAsia="宋体" w:cs="宋体"/>
         </w:rPr>
-        <w:t>GUI 模块基于 Qt5 Graphics View 框架实现，采用 MVVM 风格架构：</w:t>
+        <w:t>GUI模块基于Qt5 Graphics View框架实现，采用MVVM风格架构：</w:t>
       </w:r>
     </w:p>
     <w:p>
@@ -2023,7 +2010,7 @@
         <w:rPr>
           <w:rFonts w:hint="eastAsia" w:ascii="宋体" w:hAnsi="宋体" w:eastAsia="宋体" w:cs="宋体"/>
         </w:rPr>
-        <w:t>NodeGraphicsItem：自定义 QGraphicsItem，绘制圆角矩形节点，标题栏使用分类颜色标识，输入/输出端口分布在左右两侧。</w:t>
+        <w:t>NodeGraphicsItem：自定义QGraphicsItem，绘制圆角矩形节点，标题栏使用分类颜色标识，输入/输出端口分布在左右两侧。</w:t>
       </w:r>
     </w:p>
     <w:p>
@@ -2037,7 +2024,7 @@
         <w:rPr>
           <w:rFonts w:hint="eastAsia" w:ascii="宋体" w:hAnsi="宋体" w:eastAsia="宋体" w:cs="宋体"/>
         </w:rPr>
-        <w:t>PreviewDialog / ConnectionGraphicsItem：三次贝塞尔曲线连接线；双击节点打开对比预览对话框（平行对比原图与结果图，勾选 Compare 切换并列/叠加视图）；右键可删除连线。</w:t>
+        <w:t>PreviewDialog / ConnectionGraphicsItem：三次贝塞尔曲线连接线；双击节点打开对比预览对话框（平行对比原图与结果图，勾选Compare切换并列/叠加视图）；右键可删除连线。</w:t>
       </w:r>
     </w:p>
     <w:p>
@@ -2065,7 +2052,7 @@
         <w:rPr>
           <w:rFonts w:hint="eastAsia" w:ascii="宋体" w:hAnsi="宋体" w:eastAsia="宋体" w:cs="宋体"/>
         </w:rPr>
-        <w:t>3.5 序列化与命令行</w:t>
+        <w:t>3.5序列化与命令行</w:t>
       </w:r>
     </w:p>
     <w:p>
@@ -2078,7 +2065,7 @@
         <w:rPr>
           <w:rFonts w:hint="eastAsia" w:ascii="宋体" w:hAnsi="宋体" w:eastAsia="宋体" w:cs="宋体"/>
         </w:rPr>
-        <w:t>WorkflowSerializer 将工作流保存为 JSON 格式，包含节点（类型、ID、位置、参数）和连线（源/目标节点 ID 及端口索引）信息。支持从命令行无 GUI 执行工作流（ImageNodeEditor.exe --no-gui --workflow xxx.json），并可覆盖输入/输出图像路径（--image / --output 参数）。</w:t>
+        <w:t>WorkflowSerializer将工作流保存为JSON格式，包含节点（类型、ID、位置、参数）和连线（源/目标节点ID及端口索引）信息。支持从命令行无GUI执行工作流（ImageNodeEditor.exe --no-gui --workflow xxx.json），并可覆盖输入/输出图像路径（--image / --output参数）。</w:t>
       </w:r>
     </w:p>
     <w:p>
@@ -2106,7 +2093,7 @@
         <w:rPr>
           <w:rFonts w:hint="eastAsia" w:ascii="宋体" w:hAnsi="宋体" w:eastAsia="宋体" w:cs="宋体"/>
         </w:rPr>
-        <w:t>4.1 设计亮点</w:t>
+        <w:t>4.1设计亮点</w:t>
       </w:r>
     </w:p>
     <w:p>
@@ -2120,7 +2107,7 @@
         <w:rPr>
           <w:rFonts w:hint="eastAsia" w:ascii="宋体" w:hAnsi="宋体" w:eastAsia="宋体" w:cs="宋体"/>
         </w:rPr>
-        <w:t>模块化设计：算法层与节点层完全解耦，ImageAlgorithm 的纯函数设计便于单元测试和复用。</w:t>
+        <w:t>模块化设计：算法层与节点层完全解耦，ImageAlgorithm的纯函数设计便于单元测试和复用。</w:t>
       </w:r>
     </w:p>
     <w:p>
@@ -2134,7 +2121,7 @@
         <w:rPr>
           <w:rFonts w:hint="eastAsia" w:ascii="宋体" w:hAnsi="宋体" w:eastAsia="宋体" w:cs="宋体"/>
         </w:rPr>
-        <w:t>参数边界约束：ParamBound 机制确保 UI 控件自动限制在有效范围，防止越界错误。</w:t>
+        <w:t>参数边界约束：ParamBound机制确保UI控件自动限制在有效范围，防止越界错误。</w:t>
       </w:r>
     </w:p>
     <w:p>
@@ -2162,7 +2149,7 @@
         <w:rPr>
           <w:rFonts w:hint="eastAsia" w:ascii="宋体" w:hAnsi="宋体" w:eastAsia="宋体" w:cs="宋体"/>
         </w:rPr>
-        <w:t>可达性分析：执行前的双向 BFS 分析避免执行孤立节点，提高效率并给出清晰错误提示。</w:t>
+        <w:t>可达性分析：执行前的双向BFS分析避免执行孤立节点，提高效率并给出清晰错误提示。</w:t>
       </w:r>
     </w:p>
     <w:p>
@@ -2176,7 +2163,7 @@
         <w:rPr>
           <w:rFonts w:hint="eastAsia" w:ascii="宋体" w:hAnsi="宋体" w:eastAsia="宋体" w:cs="宋体"/>
         </w:rPr>
-        <w:t>4.2 存在问题与改进方向</w:t>
+        <w:t>4.2存在问题与改进方向</w:t>
       </w:r>
     </w:p>
     <w:p>
@@ -2190,7 +2177,7 @@
         <w:rPr>
           <w:rFonts w:hint="eastAsia" w:ascii="宋体" w:hAnsi="宋体" w:eastAsia="宋体" w:cs="宋体"/>
         </w:rPr>
-        <w:t>撤销功能覆盖不全：已实现 Ctrl+Z 撤销最多 50 步（添加/删除节点、连线等），但缺少重做(Redo)功能，替换节点回滚机制处理较保守，某些极端场景下可能残留不一致状态。</w:t>
+        <w:t>撤销功能覆盖不全：已实现Ctrl+Z撤销最多50步（添加/删除节点、连线等），但缺少重做(Redo)功能，替换节点回滚机制处理较保守，某些极端场景下可能残留不一致状态。</w:t>
       </w:r>
     </w:p>
     <w:p>
@@ -2204,7 +2191,7 @@
         <w:rPr>
           <w:rFonts w:hint="eastAsia" w:ascii="宋体" w:hAnsi="宋体" w:eastAsia="宋体" w:cs="宋体"/>
         </w:rPr>
-        <w:t>类别名称不一致：早期 33 个节点中存在中英文混用问题（已修复为全中文分类），但个别节点如 PixelateNode 的 category() 仍返回英文"Stylize"，需统一检查。</w:t>
+        <w:t>类别名称不一致：早期33个节点中存在中英文混用问题（已修复为全中文分类），但个别节点如PixelateNode的category() 仍返回英文"Stylize"，需统一检查。</w:t>
       </w:r>
     </w:p>
     <w:p>
@@ -2218,7 +2205,7 @@
         <w:rPr>
           <w:rFonts w:hint="eastAsia" w:ascii="宋体" w:hAnsi="宋体" w:eastAsia="宋体" w:cs="宋体"/>
         </w:rPr>
-        <w:t>锐化算法精度：当前使用 4-邻域拉普拉斯核，效果弱于标准 8-邻域或 Unsharp Mask 方案。</w:t>
+        <w:t>锐化算法精度：当前使用4-邻域拉普拉斯核，效果弱于标准8-邻域或Unsharp Mask方案。</w:t>
       </w:r>
     </w:p>
     <w:p>
@@ -2232,7 +2219,7 @@
         <w:rPr>
           <w:rFonts w:hint="eastAsia" w:ascii="宋体" w:hAnsi="宋体" w:eastAsia="宋体" w:cs="宋体"/>
         </w:rPr>
-        <w:t>缺失图像格式支持：WebP、SVG 等格式依赖 Qt 插件，conda 环境下的 imageformats 插件部署需手动配置。</w:t>
+        <w:t>缺失图像格式支持：WebP、SVG等格式依赖Qt插件，conda环境下的imageformats插件部署需手动配置。</w:t>
       </w:r>
     </w:p>
     <w:p>
@@ -2288,7 +2275,7 @@
         <w:rPr>
           <w:rFonts w:hint="eastAsia" w:ascii="宋体" w:hAnsi="宋体" w:eastAsia="宋体" w:cs="宋体"/>
         </w:rPr>
-        <w:t>自动连线算法修复：遍历池中所有类型兼容的候选输出，逐个尝试 canConnect 直至成功，解决了终端节点在有现存连线时连不上的问题。</w:t>
+        <w:t>自动连线算法修复：遍历池中所有类型兼容的候选输出，逐个尝试canConnect直至成功，解决了终端节点在有现存连线时连不上的问题。</w:t>
       </w:r>
     </w:p>
     <w:p>
@@ -2316,7 +2303,7 @@
         <w:rPr>
           <w:rFonts w:hint="eastAsia" w:ascii="宋体" w:hAnsi="宋体" w:eastAsia="宋体" w:cs="宋体"/>
         </w:rPr>
-        <w:t>拖拽连线体验优化：增大端口点击区域，释放时 20px 半径自动吸附最近端口。</w:t>
+        <w:t>拖拽连线体验优化：增大端口点击区域，释放时20px半径自动吸附最近端口。</w:t>
       </w:r>
     </w:p>
     <w:p>
@@ -2330,7 +2317,7 @@
         <w:rPr>
           <w:rFonts w:hint="eastAsia" w:ascii="宋体" w:hAnsi="宋体" w:eastAsia="宋体" w:cs="宋体"/>
         </w:rPr>
-        <w:t>参数面板中文化：全面补全 60+ 参数的中文标签映射。</w:t>
+        <w:t>参数面板中文化：全面补全60+ 参数的中文标签映射。</w:t>
       </w:r>
     </w:p>
     <w:p>
@@ -2344,7 +2331,7 @@
         <w:rPr>
           <w:rFonts w:hint="eastAsia" w:ascii="宋体" w:hAnsi="宋体" w:eastAsia="宋体" w:cs="宋体"/>
         </w:rPr>
-        <w:t>4.3 经验总结</w:t>
+        <w:t>4.3经验总结</w:t>
       </w:r>
     </w:p>
     <w:p>
@@ -2357,7 +2344,14 @@
         <w:rPr>
           <w:rFonts w:hint="eastAsia" w:ascii="宋体" w:hAnsi="宋体" w:eastAsia="宋体" w:cs="宋体"/>
         </w:rPr>
-        <w:t>通过本项目深入实践了 C++17 和 Qt5 GUI 编程，掌握了 Graphics View 框架的自定义图形项和事件处理机制、基于 DAG 的工作流引擎设计、以及多种图像处理算法的实现。项目从最初的简单滤镜工具逐步演进为功能较完整的节点编辑器，过程中进行了多次重构（算法与节点解耦、参数系统统一化、引擎执行优化），验证了良好的架构设计对项目可维护性和可扩展性的重要性。</w:t>
+        <w:t>本项目深入实践了C++17和Qt5 GUI编程，掌握了Graphics View框架的自定义图形项和事件处理机制、基于DAG的工作流引擎设计、以及多种图像处理算法的实现。项目从最初的简单滤镜工具逐步演进为功能较完整的节点编辑器，过程中进行了多次重构（算法与节点解耦、参数系统统一化、引擎执行优化），验证了良好的架构设计对项目可维护性和可扩展性的重要性。</w:t>
+      </w:r>
+      <w:bookmarkStart w:id="0" w:name="_GoBack"/>
+      <w:bookmarkEnd w:id="0"/>
+      <w:r>
+        <w:rPr>
+          <w:rFonts w:hint="eastAsia" w:ascii="宋体" w:hAnsi="宋体" w:eastAsia="宋体" w:cs="宋体"/>
+        </w:rPr>
       </w:r>
     </w:p>
     <w:sectPr>
@@ -2728,7 +2722,7 @@
     <w:lsdException w:qFormat="1" w:unhideWhenUsed="0" w:uiPriority="63" w:semiHidden="0" w:name="Medium Shading 1"/>
     <w:lsdException w:qFormat="1" w:unhideWhenUsed="0" w:uiPriority="64" w:semiHidden="0" w:name="Medium Shading 2"/>
     <w:lsdException w:unhideWhenUsed="0" w:uiPriority="65" w:semiHidden="0" w:name="Medium List 1"/>
-    <w:lsdException w:unhideWhenUsed="0" w:uiPriority="66" w:semiHidden="0" w:name="Medium List 2"/>
+    <w:lsdException w:qFormat="1" w:unhideWhenUsed="0" w:uiPriority="66" w:semiHidden="0" w:name="Medium List 2"/>
     <w:lsdException w:unhideWhenUsed="0" w:uiPriority="67" w:semiHidden="0" w:name="Medium Grid 1"/>
     <w:lsdException w:unhideWhenUsed="0" w:uiPriority="68" w:semiHidden="0" w:name="Medium Grid 2"/>
     <w:lsdException w:unhideWhenUsed="0" w:uiPriority="69" w:semiHidden="0" w:name="Medium Grid 3"/>
@@ -2741,15 +2735,15 @@
     <w:lsdException w:unhideWhenUsed="0" w:uiPriority="62" w:semiHidden="0" w:name="Light Grid Accent 1"/>
     <w:lsdException w:qFormat="1" w:unhideWhenUsed="0" w:uiPriority="63" w:semiHidden="0" w:name="Medium Shading 1 Accent 1"/>
     <w:lsdException w:unhideWhenUsed="0" w:uiPriority="64" w:semiHidden="0" w:name="Medium Shading 2 Accent 1"/>
-    <w:lsdException w:unhideWhenUsed="0" w:uiPriority="65" w:semiHidden="0" w:name="Medium List 1 Accent 1"/>
+    <w:lsdException w:qFormat="1" w:unhideWhenUsed="0" w:uiPriority="65" w:semiHidden="0" w:name="Medium List 1 Accent 1"/>
     <w:lsdException w:qFormat="1" w:unhideWhenUsed="0" w:uiPriority="34" w:semiHidden="0" w:name="List Paragraph"/>
     <w:lsdException w:qFormat="1" w:unhideWhenUsed="0" w:uiPriority="29" w:semiHidden="0" w:name="Quote"/>
     <w:lsdException w:qFormat="1" w:unhideWhenUsed="0" w:uiPriority="30" w:semiHidden="0" w:name="Intense Quote"/>
-    <w:lsdException w:unhideWhenUsed="0" w:uiPriority="66" w:semiHidden="0" w:name="Medium List 2 Accent 1"/>
+    <w:lsdException w:qFormat="1" w:unhideWhenUsed="0" w:uiPriority="66" w:semiHidden="0" w:name="Medium List 2 Accent 1"/>
     <w:lsdException w:unhideWhenUsed="0" w:uiPriority="67" w:semiHidden="0" w:name="Medium Grid 1 Accent 1"/>
-    <w:lsdException w:unhideWhenUsed="0" w:uiPriority="68" w:semiHidden="0" w:name="Medium Grid 2 Accent 1"/>
+    <w:lsdException w:qFormat="1" w:unhideWhenUsed="0" w:uiPriority="68" w:semiHidden="0" w:name="Medium Grid 2 Accent 1"/>
     <w:lsdException w:unhideWhenUsed="0" w:uiPriority="69" w:semiHidden="0" w:name="Medium Grid 3 Accent 1"/>
-    <w:lsdException w:unhideWhenUsed="0" w:uiPriority="70" w:semiHidden="0" w:name="Dark List Accent 1"/>
+    <w:lsdException w:qFormat="1" w:unhideWhenUsed="0" w:uiPriority="70" w:semiHidden="0" w:name="Dark List Accent 1"/>
     <w:lsdException w:unhideWhenUsed="0" w:uiPriority="71" w:semiHidden="0" w:name="Colorful Shading Accent 1"/>
     <w:lsdException w:unhideWhenUsed="0" w:uiPriority="72" w:semiHidden="0" w:name="Colorful List Accent 1"/>
     <w:lsdException w:unhideWhenUsed="0" w:uiPriority="73" w:semiHidden="0" w:name="Colorful Grid Accent 1"/>
@@ -2759,10 +2753,10 @@
     <w:lsdException w:qFormat="1" w:unhideWhenUsed="0" w:uiPriority="63" w:semiHidden="0" w:name="Medium Shading 1 Accent 2"/>
     <w:lsdException w:unhideWhenUsed="0" w:uiPriority="64" w:semiHidden="0" w:name="Medium Shading 2 Accent 2"/>
     <w:lsdException w:unhideWhenUsed="0" w:uiPriority="65" w:semiHidden="0" w:name="Medium List 1 Accent 2"/>
-    <w:lsdException w:unhideWhenUsed="0" w:uiPriority="66" w:semiHidden="0" w:name="Medium List 2 Accent 2"/>
+    <w:lsdException w:qFormat="1" w:unhideWhenUsed="0" w:uiPriority="66" w:semiHidden="0" w:name="Medium List 2 Accent 2"/>
     <w:lsdException w:unhideWhenUsed="0" w:uiPriority="67" w:semiHidden="0" w:name="Medium Grid 1 Accent 2"/>
-    <w:lsdException w:unhideWhenUsed="0" w:uiPriority="68" w:semiHidden="0" w:name="Medium Grid 2 Accent 2"/>
-    <w:lsdException w:unhideWhenUsed="0" w:uiPriority="69" w:semiHidden="0" w:name="Medium Grid 3 Accent 2"/>
+    <w:lsdException w:qFormat="1" w:unhideWhenUsed="0" w:uiPriority="68" w:semiHidden="0" w:name="Medium Grid 2 Accent 2"/>
+    <w:lsdException w:qFormat="1" w:unhideWhenUsed="0" w:uiPriority="69" w:semiHidden="0" w:name="Medium Grid 3 Accent 2"/>
     <w:lsdException w:unhideWhenUsed="0" w:uiPriority="70" w:semiHidden="0" w:name="Dark List Accent 2"/>
     <w:lsdException w:unhideWhenUsed="0" w:uiPriority="71" w:semiHidden="0" w:name="Colorful Shading Accent 2"/>
     <w:lsdException w:unhideWhenUsed="0" w:uiPriority="72" w:semiHidden="0" w:name="Colorful List Accent 2"/>
@@ -2773,9 +2767,9 @@
     <w:lsdException w:qFormat="1" w:unhideWhenUsed="0" w:uiPriority="63" w:semiHidden="0" w:name="Medium Shading 1 Accent 3"/>
     <w:lsdException w:qFormat="1" w:unhideWhenUsed="0" w:uiPriority="64" w:semiHidden="0" w:name="Medium Shading 2 Accent 3"/>
     <w:lsdException w:unhideWhenUsed="0" w:uiPriority="65" w:semiHidden="0" w:name="Medium List 1 Accent 3"/>
-    <w:lsdException w:unhideWhenUsed="0" w:uiPriority="66" w:semiHidden="0" w:name="Medium List 2 Accent 3"/>
+    <w:lsdException w:qFormat="1" w:unhideWhenUsed="0" w:uiPriority="66" w:semiHidden="0" w:name="Medium List 2 Accent 3"/>
     <w:lsdException w:unhideWhenUsed="0" w:uiPriority="67" w:semiHidden="0" w:name="Medium Grid 1 Accent 3"/>
-    <w:lsdException w:unhideWhenUsed="0" w:uiPriority="68" w:semiHidden="0" w:name="Medium Grid 2 Accent 3"/>
+    <w:lsdException w:qFormat="1" w:unhideWhenUsed="0" w:uiPriority="68" w:semiHidden="0" w:name="Medium Grid 2 Accent 3"/>
     <w:lsdException w:unhideWhenUsed="0" w:uiPriority="69" w:semiHidden="0" w:name="Medium Grid 3 Accent 3"/>
     <w:lsdException w:unhideWhenUsed="0" w:uiPriority="70" w:semiHidden="0" w:name="Dark List Accent 3"/>
     <w:lsdException w:unhideWhenUsed="0" w:uiPriority="71" w:semiHidden="0" w:name="Colorful Shading Accent 3"/>
@@ -2784,13 +2778,13 @@
     <w:lsdException w:unhideWhenUsed="0" w:uiPriority="60" w:semiHidden="0" w:name="Light Shading Accent 4"/>
     <w:lsdException w:unhideWhenUsed="0" w:uiPriority="61" w:semiHidden="0" w:name="Light List Accent 4"/>
     <w:lsdException w:qFormat="1" w:unhideWhenUsed="0" w:uiPriority="62" w:semiHidden="0" w:name="Light Grid Accent 4"/>
-    <w:lsdException w:unhideWhenUsed="0" w:uiPriority="63" w:semiHidden="0" w:name="Medium Shading 1 Accent 4"/>
-    <w:lsdException w:unhideWhenUsed="0" w:uiPriority="64" w:semiHidden="0" w:name="Medium Shading 2 Accent 4"/>
+    <w:lsdException w:qFormat="1" w:unhideWhenUsed="0" w:uiPriority="63" w:semiHidden="0" w:name="Medium Shading 1 Accent 4"/>
+    <w:lsdException w:qFormat="1" w:unhideWhenUsed="0" w:uiPriority="64" w:semiHidden="0" w:name="Medium Shading 2 Accent 4"/>
     <w:lsdException w:unhideWhenUsed="0" w:uiPriority="65" w:semiHidden="0" w:name="Medium List 1 Accent 4"/>
     <w:lsdException w:unhideWhenUsed="0" w:uiPriority="66" w:semiHidden="0" w:name="Medium List 2 Accent 4"/>
     <w:lsdException w:unhideWhenUsed="0" w:uiPriority="67" w:semiHidden="0" w:name="Medium Grid 1 Accent 4"/>
     <w:lsdException w:unhideWhenUsed="0" w:uiPriority="68" w:semiHidden="0" w:name="Medium Grid 2 Accent 4"/>
-    <w:lsdException w:unhideWhenUsed="0" w:uiPriority="69" w:semiHidden="0" w:name="Medium Grid 3 Accent 4"/>
+    <w:lsdException w:qFormat="1" w:unhideWhenUsed="0" w:uiPriority="69" w:semiHidden="0" w:name="Medium Grid 3 Accent 4"/>
     <w:lsdException w:unhideWhenUsed="0" w:uiPriority="70" w:semiHidden="0" w:name="Dark List Accent 4"/>
     <w:lsdException w:unhideWhenUsed="0" w:uiPriority="71" w:semiHidden="0" w:name="Colorful Shading Accent 4"/>
     <w:lsdException w:qFormat="1" w:unhideWhenUsed="0" w:uiPriority="72" w:semiHidden="0" w:name="Colorful List Accent 4"/>
@@ -6082,6 +6076,7 @@
   <w:style w:type="table" w:styleId="59">
     <w:name w:val="Medium Shading 1 Accent 4"/>
     <w:basedOn w:val="32"/>
+    <w:qFormat/>
     <w:uiPriority w:val="63"/>
     <w:pPr>
       <w:spacing w:after="0" w:line="240" w:lineRule="auto"/>
@@ -7067,6 +7062,7 @@
   <w:style w:type="table" w:styleId="66">
     <w:name w:val="Medium Shading 2 Accent 4"/>
     <w:basedOn w:val="32"/>
+    <w:qFormat/>
     <w:uiPriority w:val="64"/>
     <w:pPr>
       <w:spacing w:after="0" w:line="240" w:lineRule="auto"/>
@@ -7652,6 +7648,7 @@
   <w:style w:type="table" w:styleId="70">
     <w:name w:val="Medium List 1 Accent 1"/>
     <w:basedOn w:val="32"/>
+    <w:qFormat/>
     <w:uiPriority w:val="65"/>
     <w:pPr>
       <w:spacing w:after="0" w:line="240" w:lineRule="auto"/>
@@ -8192,6 +8189,7 @@
   <w:style w:type="table" w:styleId="76">
     <w:name w:val="Medium List 2"/>
     <w:basedOn w:val="32"/>
+    <w:qFormat/>
     <w:uiPriority w:val="66"/>
     <w:pPr>
       <w:spacing w:after="0" w:line="240" w:lineRule="auto"/>
@@ -8321,6 +8319,7 @@
   <w:style w:type="table" w:styleId="77">
     <w:name w:val="Medium List 2 Accent 1"/>
     <w:basedOn w:val="32"/>
+    <w:qFormat/>
     <w:uiPriority w:val="66"/>
     <w:pPr>
       <w:spacing w:after="0" w:line="240" w:lineRule="auto"/>
@@ -8450,6 +8449,7 @@
   <w:style w:type="table" w:styleId="78">
     <w:name w:val="Medium List 2 Accent 2"/>
     <w:basedOn w:val="32"/>
+    <w:qFormat/>
     <w:uiPriority w:val="66"/>
     <w:pPr>
       <w:spacing w:after="0" w:line="240" w:lineRule="auto"/>
@@ -8579,6 +8579,7 @@
   <w:style w:type="table" w:styleId="79">
     <w:name w:val="Medium List 2 Accent 3"/>
     <w:basedOn w:val="32"/>
+    <w:qFormat/>
     <w:uiPriority w:val="66"/>
     <w:pPr>
       <w:spacing w:after="0" w:line="240" w:lineRule="auto"/>
@@ -9724,6 +9725,7 @@
   <w:style w:type="table" w:styleId="91">
     <w:name w:val="Medium Grid 2 Accent 1"/>
     <w:basedOn w:val="32"/>
+    <w:qFormat/>
     <w:uiPriority w:val="68"/>
     <w:pPr>
       <w:spacing w:after="0" w:line="240" w:lineRule="auto"/>
@@ -9870,6 +9872,7 @@
   <w:style w:type="table" w:styleId="92">
     <w:name w:val="Medium Grid 2 Accent 2"/>
     <w:basedOn w:val="32"/>
+    <w:qFormat/>
     <w:uiPriority w:val="68"/>
     <w:pPr>
       <w:spacing w:after="0" w:line="240" w:lineRule="auto"/>
@@ -10016,6 +10019,7 @@
   <w:style w:type="table" w:styleId="93">
     <w:name w:val="Medium Grid 2 Accent 3"/>
     <w:basedOn w:val="32"/>
+    <w:qFormat/>
     <w:uiPriority w:val="68"/>
     <w:pPr>
       <w:spacing w:after="0" w:line="240" w:lineRule="auto"/>
@@ -10914,6 +10918,7 @@
   <w:style w:type="table" w:styleId="99">
     <w:name w:val="Medium Grid 3 Accent 2"/>
     <w:basedOn w:val="32"/>
+    <w:qFormat/>
     <w:uiPriority w:val="69"/>
     <w:pPr>
       <w:spacing w:after="0" w:line="240" w:lineRule="auto"/>
@@ -11228,6 +11233,7 @@
   <w:style w:type="table" w:styleId="101">
     <w:name w:val="Medium Grid 3 Accent 4"/>
     <w:basedOn w:val="32"/>
+    <w:qFormat/>
     <w:uiPriority w:val="69"/>
     <w:pPr>
       <w:spacing w:after="0" w:line="240" w:lineRule="auto"/>
@@ -11814,6 +11820,7 @@
   <w:style w:type="table" w:styleId="105">
     <w:name w:val="Dark List Accent 1"/>
     <w:basedOn w:val="32"/>
+    <w:qFormat/>
     <w:uiPriority w:val="70"/>
     <w:pPr>
       <w:spacing w:after="0" w:line="240" w:lineRule="auto"/>

</xml_diff>